<commit_message>
Add seed 1: 336 data-budget runs, two fine-tuning seeds
- Farm advantage in the regression depends on the seven-farm sets (excl. k=1 excludes 0; excl. k=7 does not).
- Schedule comparison made like-for-like (seed 42 vs seed 42).
- Whole-half fine-tuning loss now within uncertainty; text and verifier say so.
- README numbers, table wording (images per farm) updated.

Co-Authored-By: Claude Opus 5.5 <noreply@anthropic.com>
Claude-Session: https://claude.ai/code/session_01MKk9JY43DLLC2GkbFX456R
</commit_message>
<xml_diff>
--- a/paper/manuscript.docx
+++ b/paper/manuscript.docx
@@ -63,7 +63,7 @@
         <w:t xml:space="preserve">Durio zibethinus</w:t>
       </w:r>
       <w:r>
-        <w:t xml:space="preserve">) disease and pest detectors are used on farms absent from their training data, yet are commonly scored on a random split of images from the training farms. We measured the gap on 827 annotated images (733 with lesion boxes) from eight commercial farms in Peninsular Malaysia and 281 from two orchards in Sabah. With each held-out farm excluded from training, early stopping and checkpoint selection, six detectors scored 1.6–2.3 times lower mAP50 on unseen farms than on a random split; YOLO11n fell from 0.428 to 0.223. The held-out farm mattered more than the detector: per-farm scores spanned 0.094–0.356, whereas the six detectors’ mean scores differed by at most 0.022. Psyllid and psyllid damage kept 25–30% of their random-split AP on unseen farms; the other classes kept 48–59%. In 168 fixed-iteration training runs varying the number of training farms (1, 2, 4 or 7) and images per farm (15, 50 or all), doubling farms raised unseen-farm mAP50 by 0.039 and doubling images per farm by 0.030, a difference within the uncertainty. With the recipe tested, fine-tuning on a new farm’s images alone lowered its mAP50 at every size (by 0.121 with 5 images, 0.044 with about 50); adding about 50 such images to the training set and retraining raised it by 0.053. Orchard detectors should be evaluated on held-out farms, collections should first cover the region’s farms and classes, and a new farm’s images belong in the training data, not in fine-tuning alone.</w:t>
+        <w:t xml:space="preserve">) disease and pest detectors are used on farms absent from their training data, yet are commonly scored on a random split of images from the training farms. We measured the gap on 827 annotated images (733 with lesion boxes) from eight commercial farms in Peninsular Malaysia and 281 from two orchards in Sabah. With each held-out farm excluded from training, early stopping and checkpoint selection, six detectors scored 1.6–2.3 times lower mAP50 on unseen farms than on a random split; YOLO11n fell from 0.428 to 0.223. The held-out farm mattered more than the detector: per-farm scores spanned 0.094–0.356, whereas the six detectors’ mean scores differed by at most 0.022. Psyllid and psyllid damage kept 25–30% of their random-split AP on unseen farms; the other classes kept 48–59%. In 336 fixed-iteration training runs varying the number of training farms (1, 2, 4 or 7) and images per farm (15, 50 or all), doubling farms raised unseen-farm mAP50 by 0.038 and doubling images per farm by 0.028, a difference within the uncertainty. With the recipe tested, fine-tuning on a new farm’s images alone lowered its mAP50 at every size (by 0.111 with 5 images, 0.029 with about 50); adding about 50 such images to the training set and retraining raised it by 0.053. Orchard detectors should be evaluated on held-out farms, collections should first cover the region’s farms and classes, and a new farm’s images belong in the training data, not in fine-tuning alone.</w:t>
       </w:r>
     </w:p>
     <w:p>
@@ -147,7 +147,7 @@
         <w:pStyle w:val="Compact"/>
       </w:pPr>
       <w:r>
-        <w:t xml:space="preserve">A controlled experiment of 168 training runs, all trained for the same number of iterations, that varies the number of training farms and the number of images per farm independently.</w:t>
+        <w:t xml:space="preserve">A controlled experiment of 336 training runs, all trained for the same number of iterations, that varies the number of training farms and the number of images per farm independently.</w:t>
       </w:r>
     </w:p>
     <w:p>
@@ -1718,7 +1718,7 @@
         <w:t xml:space="preserve"> </w:t>
       </w:r>
       <w:r>
-        <w:t xml:space="preserve">= 7 there is only one. Within a combination the three image counts are nested (15 ⊂ 50 ⊂ all), so comparisons between them are paired. The design gives 168 training sets over eight held-out farms, each trained with one seed (42).</w:t>
+        <w:t xml:space="preserve">= 7 there is only one. Within a combination the three image counts are nested (15 ⊂ 50 ⊂ all), so comparisons between them are paired. The design gives 168 training sets over eight held-out farms, each trained with two seeds (1 and 42).</w:t>
       </w:r>
     </w:p>
     <w:p>
@@ -1760,7 +1760,7 @@
         <w:t xml:space="preserve"> </w:t>
       </w:r>
       <w:r>
-        <w:t xml:space="preserve">∈ {5, 10, 20, all} images were drawn at random (nested). The starting model was the data-budget model trained on all images of the other seven farms. Two ways of using the calibration images were compared, each with a fixed optimisation budget and no checkpoint selection: fine-tuning the starting model on the calibration images alone (weights and batch-normalisation statistics of the first 10 modules frozen, AdamW, learning rate 5 × 10⁻⁴, no warm-up, batch 16 without gradient accumulation, about 300 optimiser steps, default augmentation; Note S1), and retraining from COCO weights on the other seven farms plus the calibration images under the protocol of Section 2.6. Both were scored on the same test half as the uncalibrated starting model. Fine-tuning was run with one seed (42) and retraining with one seed (42).</w:t>
+        <w:t xml:space="preserve">∈ {5, 10, 20, all} images were drawn at random (nested). The starting model was the data-budget model trained on all images of the other seven farms. Two ways of using the calibration images were compared, each with a fixed optimisation budget and no checkpoint selection: fine-tuning the starting model on the calibration images alone (weights and batch-normalisation statistics of the first 10 modules frozen, AdamW, learning rate 5 × 10⁻⁴, no warm-up, batch 16 without gradient accumulation, about 300 optimiser steps, default augmentation; Note S1), and retraining from COCO weights on the other seven farms plus the calibration images under the protocol of Section 2.6. Both were scored on the same test half as the uncalibrated starting model. Fine-tuning was run with two seeds (1 and 42) and retraining with one seed (42).</w:t>
       </w:r>
     </w:p>
     <w:bookmarkEnd w:id="31"/>
@@ -1802,7 +1802,7 @@
         <w:t xml:space="preserve"> </w:t>
       </w:r>
       <w:r>
-        <w:t xml:space="preserve">and log₂ (images per farm) with a fixed effect for each held-out farm, fitted to all 168 runs; the two slopes are the expected change in mAP50 per doubling of the number of farms at fixed images per farm, and per doubling of images per farm at fixed farms. Because a log-linear form can hide uneven steps, the individual steps (one to two, two to four and four to seven farms; 15 to 50 and 50 to all images per farm) are also reported as paired contrasts (Table S6). For each training set we computed its class coverage: the share of the held-out farm’s annotated images whose classes all occur in the images actually drawn for training. A detector cannot find a class it was never shown, so coverage indicates how much of the value of a farm lies in the classes it carries; it was added to the regression as a covariate and used to restrict it.</w:t>
+        <w:t xml:space="preserve">and log₂ (images per farm) with a fixed effect for each held-out farm, fitted to all 336 runs; the two slopes are the expected change in mAP50 per doubling of the number of farms at fixed images per farm, and per doubling of images per farm at fixed farms. Because a log-linear form can hide uneven steps, the individual steps (one to two, two to four and four to seven farms; 15 to 50 and 50 to all images per farm) are also reported as paired contrasts (Table S6). For each training set we computed its class coverage: the share of the held-out farm’s annotated images whose classes all occur in the images actually drawn for training. A detector cannot find a class it was never shown, so coverage indicates how much of the value of a farm lies in the classes it carries; it was added to the regression as a covariate and used to restrict it.</w:t>
       </w:r>
     </w:p>
     <w:bookmarkEnd w:id="32"/>
@@ -3164,7 +3164,7 @@
         <w:pStyle w:val="FirstParagraph"/>
       </w:pPr>
       <w:r>
-        <w:t xml:space="preserve">With the number of iterations held constant, unseen-farm mAP50 rose with both the number of training farms and the number of images per farm (Fig. 3a, Table 4; each held-out farm in Table S4). Training on one farm gave 0.074 with all of its images; all images of seven farms gave 0.235. Fitted over all 168 runs, doubling the number of farms changed mAP50 by 0.039 (90% interval 0.025 to 0.053) and doubling images per farm by 0.030 (0.023 to 0.039). The difference between the two slopes, 0.009 (−0.003 to 0.023), was within the uncertainty, and it remained so when the seven-farm runs or the one-farm runs were left out (Table 5B).</w:t>
+        <w:t xml:space="preserve">With the number of iterations held constant, unseen-farm mAP50 rose with both the number of training farms and the number of images per farm (Fig. 3a, Table 4; each held-out farm in Table S4). Training on one farm gave 0.078 with all of its images; all images of seven farms gave 0.228. Fitted over all 336 runs, doubling the number of farms changed mAP50 by 0.038 (90% interval 0.023 to 0.053) and doubling images per farm by 0.028 (0.021 to 0.038). The difference between the two slopes, 0.010 (−0.003 to 0.025), was within the uncertainty. Without the seven-farm runs it vanished (0.001; −0.012 to 0.015), whereas without the one-farm runs the farm slope was the larger (0.013; 0.002 to 0.024); whatever advantage farms have in this design comes from the seven-farm training sets (Table 5B).</w:t>
       </w:r>
     </w:p>
     <w:p>
@@ -3225,7 +3225,7 @@
               <w:jc w:val="left"/>
             </w:pPr>
             <w:r>
-              <w:t xml:space="preserve">Photos per farm</w:t>
+              <w:t xml:space="preserve">Images per farm</w:t>
             </w:r>
           </w:p>
         </w:tc>
@@ -3335,19 +3335,19 @@
               <w:jc w:val="left"/>
             </w:pPr>
             <w:r>
-              <w:t xml:space="preserve">0.029 [0.016, 0.043]</w:t>
-            </w:r>
-          </w:p>
-        </w:tc>
-        <w:tc>
-          <w:tcPr/>
-          <w:p>
-            <w:pPr>
-              <w:pStyle w:val="Compact"/>
-              <w:jc w:val="left"/>
-            </w:pPr>
-            <w:r>
-              <w:t xml:space="preserve">0.002–0.076</w:t>
+              <w:t xml:space="preserve">0.028 [0.017, 0.042]</w:t>
+            </w:r>
+          </w:p>
+        </w:tc>
+        <w:tc>
+          <w:tcPr/>
+          <w:p>
+            <w:pPr>
+              <w:pStyle w:val="Compact"/>
+              <w:jc w:val="left"/>
+            </w:pPr>
+            <w:r>
+              <w:t xml:space="preserve">0.001–0.074</w:t>
             </w:r>
           </w:p>
         </w:tc>
@@ -3371,7 +3371,7 @@
               <w:jc w:val="left"/>
             </w:pPr>
             <w:r>
-              <w:t xml:space="preserve">0.041</w:t>
+              <w:t xml:space="preserve">0.040</w:t>
             </w:r>
           </w:p>
         </w:tc>
@@ -3421,19 +3421,19 @@
               <w:jc w:val="left"/>
             </w:pPr>
             <w:r>
-              <w:t xml:space="preserve">0.045 [0.030, 0.059]</w:t>
-            </w:r>
-          </w:p>
-        </w:tc>
-        <w:tc>
-          <w:tcPr/>
-          <w:p>
-            <w:pPr>
-              <w:pStyle w:val="Compact"/>
-              <w:jc w:val="left"/>
-            </w:pPr>
-            <w:r>
-              <w:t xml:space="preserve">0.009–0.082</w:t>
+              <w:t xml:space="preserve">0.046 [0.030, 0.062]</w:t>
+            </w:r>
+          </w:p>
+        </w:tc>
+        <w:tc>
+          <w:tcPr/>
+          <w:p>
+            <w:pPr>
+              <w:pStyle w:val="Compact"/>
+              <w:jc w:val="left"/>
+            </w:pPr>
+            <w:r>
+              <w:t xml:space="preserve">0.008–0.088</w:t>
             </w:r>
           </w:p>
         </w:tc>
@@ -3457,7 +3457,7 @@
               <w:jc w:val="left"/>
             </w:pPr>
             <w:r>
-              <w:t xml:space="preserve">0.066</w:t>
+              <w:t xml:space="preserve">0.065</w:t>
             </w:r>
           </w:p>
         </w:tc>
@@ -3507,19 +3507,19 @@
               <w:jc w:val="left"/>
             </w:pPr>
             <w:r>
-              <w:t xml:space="preserve">0.074 [0.055, 0.094]</w:t>
-            </w:r>
-          </w:p>
-        </w:tc>
-        <w:tc>
-          <w:tcPr/>
-          <w:p>
-            <w:pPr>
-              <w:pStyle w:val="Compact"/>
-              <w:jc w:val="left"/>
-            </w:pPr>
-            <w:r>
-              <w:t xml:space="preserve">0.023–0.128</w:t>
+              <w:t xml:space="preserve">0.078 [0.056, 0.101]</w:t>
+            </w:r>
+          </w:p>
+        </w:tc>
+        <w:tc>
+          <w:tcPr/>
+          <w:p>
+            <w:pPr>
+              <w:pStyle w:val="Compact"/>
+              <w:jc w:val="left"/>
+            </w:pPr>
+            <w:r>
+              <w:t xml:space="preserve">0.029–0.145</w:t>
             </w:r>
           </w:p>
         </w:tc>
@@ -3543,7 +3543,7 @@
               <w:jc w:val="left"/>
             </w:pPr>
             <w:r>
-              <w:t xml:space="preserve">0.079</w:t>
+              <w:t xml:space="preserve">0.078</w:t>
             </w:r>
           </w:p>
         </w:tc>
@@ -3593,19 +3593,19 @@
               <w:jc w:val="left"/>
             </w:pPr>
             <w:r>
-              <w:t xml:space="preserve">0.050 [0.033, 0.068]</w:t>
-            </w:r>
-          </w:p>
-        </w:tc>
-        <w:tc>
-          <w:tcPr/>
-          <w:p>
-            <w:pPr>
-              <w:pStyle w:val="Compact"/>
-              <w:jc w:val="left"/>
-            </w:pPr>
-            <w:r>
-              <w:t xml:space="preserve">0.013–0.107</w:t>
+              <w:t xml:space="preserve">0.052 [0.034, 0.071]</w:t>
+            </w:r>
+          </w:p>
+        </w:tc>
+        <w:tc>
+          <w:tcPr/>
+          <w:p>
+            <w:pPr>
+              <w:pStyle w:val="Compact"/>
+              <w:jc w:val="left"/>
+            </w:pPr>
+            <w:r>
+              <w:t xml:space="preserve">0.014–0.113</w:t>
             </w:r>
           </w:p>
         </w:tc>
@@ -3629,7 +3629,7 @@
               <w:jc w:val="left"/>
             </w:pPr>
             <w:r>
-              <w:t xml:space="preserve">0.072</w:t>
+              <w:t xml:space="preserve">0.073</w:t>
             </w:r>
           </w:p>
         </w:tc>
@@ -3679,19 +3679,19 @@
               <w:jc w:val="left"/>
             </w:pPr>
             <w:r>
-              <w:t xml:space="preserve">0.087 [0.062, 0.111]</w:t>
-            </w:r>
-          </w:p>
-        </w:tc>
-        <w:tc>
-          <w:tcPr/>
-          <w:p>
-            <w:pPr>
-              <w:pStyle w:val="Compact"/>
-              <w:jc w:val="left"/>
-            </w:pPr>
-            <w:r>
-              <w:t xml:space="preserve">0.021–0.139</w:t>
+              <w:t xml:space="preserve">0.083 [0.059, 0.105]</w:t>
+            </w:r>
+          </w:p>
+        </w:tc>
+        <w:tc>
+          <w:tcPr/>
+          <w:p>
+            <w:pPr>
+              <w:pStyle w:val="Compact"/>
+              <w:jc w:val="left"/>
+            </w:pPr>
+            <w:r>
+              <w:t xml:space="preserve">0.019–0.140</w:t>
             </w:r>
           </w:p>
         </w:tc>
@@ -3715,7 +3715,7 @@
               <w:jc w:val="left"/>
             </w:pPr>
             <w:r>
-              <w:t xml:space="preserve">0.114</w:t>
+              <w:t xml:space="preserve">0.118</w:t>
             </w:r>
           </w:p>
         </w:tc>
@@ -3765,19 +3765,19 @@
               <w:jc w:val="left"/>
             </w:pPr>
             <w:r>
-              <w:t xml:space="preserve">0.141 [0.101, 0.187]</w:t>
-            </w:r>
-          </w:p>
-        </w:tc>
-        <w:tc>
-          <w:tcPr/>
-          <w:p>
-            <w:pPr>
-              <w:pStyle w:val="Compact"/>
-              <w:jc w:val="left"/>
-            </w:pPr>
-            <w:r>
-              <w:t xml:space="preserve">0.037–0.300</w:t>
+              <w:t xml:space="preserve">0.135 [0.097, 0.176]</w:t>
+            </w:r>
+          </w:p>
+        </w:tc>
+        <w:tc>
+          <w:tcPr/>
+          <w:p>
+            <w:pPr>
+              <w:pStyle w:val="Compact"/>
+              <w:jc w:val="left"/>
+            </w:pPr>
+            <w:r>
+              <w:t xml:space="preserve">0.037–0.272</w:t>
             </w:r>
           </w:p>
         </w:tc>
@@ -3801,7 +3801,7 @@
               <w:jc w:val="left"/>
             </w:pPr>
             <w:r>
-              <w:t xml:space="preserve">0.160</w:t>
+              <w:t xml:space="preserve">0.161</w:t>
             </w:r>
           </w:p>
         </w:tc>
@@ -3851,19 +3851,19 @@
               <w:jc w:val="left"/>
             </w:pPr>
             <w:r>
-              <w:t xml:space="preserve">0.068 [0.050, 0.087]</w:t>
-            </w:r>
-          </w:p>
-        </w:tc>
-        <w:tc>
-          <w:tcPr/>
-          <w:p>
-            <w:pPr>
-              <w:pStyle w:val="Compact"/>
-              <w:jc w:val="left"/>
-            </w:pPr>
-            <w:r>
-              <w:t xml:space="preserve">0.017–0.130</w:t>
+              <w:t xml:space="preserve">0.070 [0.051, 0.088]</w:t>
+            </w:r>
+          </w:p>
+        </w:tc>
+        <w:tc>
+          <w:tcPr/>
+          <w:p>
+            <w:pPr>
+              <w:pStyle w:val="Compact"/>
+              <w:jc w:val="left"/>
+            </w:pPr>
+            <w:r>
+              <w:t xml:space="preserve">0.016–0.124</w:t>
             </w:r>
           </w:p>
         </w:tc>
@@ -3887,7 +3887,7 @@
               <w:jc w:val="left"/>
             </w:pPr>
             <w:r>
-              <w:t xml:space="preserve">0.113</w:t>
+              <w:t xml:space="preserve">0.115</w:t>
             </w:r>
           </w:p>
         </w:tc>
@@ -3937,19 +3937,19 @@
               <w:jc w:val="left"/>
             </w:pPr>
             <w:r>
-              <w:t xml:space="preserve">0.108 [0.079, 0.135]</w:t>
-            </w:r>
-          </w:p>
-        </w:tc>
-        <w:tc>
-          <w:tcPr/>
-          <w:p>
-            <w:pPr>
-              <w:pStyle w:val="Compact"/>
-              <w:jc w:val="left"/>
-            </w:pPr>
-            <w:r>
-              <w:t xml:space="preserve">0.032–0.176</w:t>
+              <w:t xml:space="preserve">0.103 [0.075, 0.128]</w:t>
+            </w:r>
+          </w:p>
+        </w:tc>
+        <w:tc>
+          <w:tcPr/>
+          <w:p>
+            <w:pPr>
+              <w:pStyle w:val="Compact"/>
+              <w:jc w:val="left"/>
+            </w:pPr>
+            <w:r>
+              <w:t xml:space="preserve">0.030–0.168</w:t>
             </w:r>
           </w:p>
         </w:tc>
@@ -3973,7 +3973,7 @@
               <w:jc w:val="left"/>
             </w:pPr>
             <w:r>
-              <w:t xml:space="preserve">0.165</w:t>
+              <w:t xml:space="preserve">0.169</w:t>
             </w:r>
           </w:p>
         </w:tc>
@@ -4023,19 +4023,19 @@
               <w:jc w:val="left"/>
             </w:pPr>
             <w:r>
-              <w:t xml:space="preserve">0.149 [0.109, 0.187]</w:t>
-            </w:r>
-          </w:p>
-        </w:tc>
-        <w:tc>
-          <w:tcPr/>
-          <w:p>
-            <w:pPr>
-              <w:pStyle w:val="Compact"/>
-              <w:jc w:val="left"/>
-            </w:pPr>
-            <w:r>
-              <w:t xml:space="preserve">0.040–0.247</w:t>
+              <w:t xml:space="preserve">0.146 [0.105, 0.185]</w:t>
+            </w:r>
+          </w:p>
+        </w:tc>
+        <w:tc>
+          <w:tcPr/>
+          <w:p>
+            <w:pPr>
+              <w:pStyle w:val="Compact"/>
+              <w:jc w:val="left"/>
+            </w:pPr>
+            <w:r>
+              <w:t xml:space="preserve">0.038–0.252</w:t>
             </w:r>
           </w:p>
         </w:tc>
@@ -4059,7 +4059,7 @@
               <w:jc w:val="left"/>
             </w:pPr>
             <w:r>
-              <w:t xml:space="preserve">0.235</w:t>
+              <w:t xml:space="preserve">0.236</w:t>
             </w:r>
           </w:p>
         </w:tc>
@@ -4109,19 +4109,19 @@
               <w:jc w:val="left"/>
             </w:pPr>
             <w:r>
-              <w:t xml:space="preserve">0.119 [0.079, 0.158]</w:t>
-            </w:r>
-          </w:p>
-        </w:tc>
-        <w:tc>
-          <w:tcPr/>
-          <w:p>
-            <w:pPr>
-              <w:pStyle w:val="Compact"/>
-              <w:jc w:val="left"/>
-            </w:pPr>
-            <w:r>
-              <w:t xml:space="preserve">0.008–0.221</w:t>
+              <w:t xml:space="preserve">0.127 [0.080, 0.176]</w:t>
+            </w:r>
+          </w:p>
+        </w:tc>
+        <w:tc>
+          <w:tcPr/>
+          <w:p>
+            <w:pPr>
+              <w:pStyle w:val="Compact"/>
+              <w:jc w:val="left"/>
+            </w:pPr>
+            <w:r>
+              <w:t xml:space="preserve">0.010–0.285</w:t>
             </w:r>
           </w:p>
         </w:tc>
@@ -4195,19 +4195,19 @@
               <w:jc w:val="left"/>
             </w:pPr>
             <w:r>
-              <w:t xml:space="preserve">0.181 [0.136, 0.221]</w:t>
-            </w:r>
-          </w:p>
-        </w:tc>
-        <w:tc>
-          <w:tcPr/>
-          <w:p>
-            <w:pPr>
-              <w:pStyle w:val="Compact"/>
-              <w:jc w:val="left"/>
-            </w:pPr>
-            <w:r>
-              <w:t xml:space="preserve">0.029–0.246</w:t>
+              <w:t xml:space="preserve">0.182 [0.137, 0.222]</w:t>
+            </w:r>
+          </w:p>
+        </w:tc>
+        <w:tc>
+          <w:tcPr/>
+          <w:p>
+            <w:pPr>
+              <w:pStyle w:val="Compact"/>
+              <w:jc w:val="left"/>
+            </w:pPr>
+            <w:r>
+              <w:t xml:space="preserve">0.022–0.245</w:t>
             </w:r>
           </w:p>
         </w:tc>
@@ -4281,19 +4281,19 @@
               <w:jc w:val="left"/>
             </w:pPr>
             <w:r>
-              <w:t xml:space="preserve">0.235 [0.181, 0.295]</w:t>
-            </w:r>
-          </w:p>
-        </w:tc>
-        <w:tc>
-          <w:tcPr/>
-          <w:p>
-            <w:pPr>
-              <w:pStyle w:val="Compact"/>
-              <w:jc w:val="left"/>
-            </w:pPr>
-            <w:r>
-              <w:t xml:space="preserve">0.099–0.444</w:t>
+              <w:t xml:space="preserve">0.228 [0.171, 0.289]</w:t>
+            </w:r>
+          </w:p>
+        </w:tc>
+        <w:tc>
+          <w:tcPr/>
+          <w:p>
+            <w:pPr>
+              <w:pStyle w:val="Compact"/>
+              <w:jc w:val="left"/>
+            </w:pPr>
+            <w:r>
+              <w:t xml:space="preserve">0.076–0.435</w:t>
             </w:r>
           </w:p>
         </w:tc>
@@ -4328,7 +4328,7 @@
         <w:pStyle w:val="BodyText"/>
       </w:pPr>
       <w:r>
-        <w:t xml:space="preserve">Every step in images per farm raised mAP50, at every number of farms (Table S6). The steps in the number of farms were uneven. With all images per farm, going from one to two farms changed mAP50 by 0.067, from two to four by 0.008 (−0.013 to 0.029) and from four to seven by 0.085; with 50 images per farm the three steps were 0.042, 0.021 and 0.073. The step from four to seven farms is confounded: seven farms is a single combination that always includes every other farm, including those most similar to the held-out one, whereas the two- and four-farm sets are two draws each. The design therefore cannot say whether the gain at seven farms reflects the number of farms or the inclusion of particular farms.</w:t>
+        <w:t xml:space="preserve">Every step in images per farm raised mAP50, at every number of farms (Table S6). The steps in the number of farms were uneven. With all images per farm, going from one to two farms changed mAP50 by 0.058, from two to four by 0.011 (−0.007 to 0.030) and from four to seven by 0.082; with 50 images per farm the three steps were 0.036, 0.020 and 0.080. The step from four to seven farms is confounded: seven farms is a single combination that always includes every other farm, including those most similar to the held-out one, whereas the two- and four-farm sets are two draws each. The design therefore cannot say whether the gain at seven farms reflects the number of farms or the inclusion of particular farms.</w:t>
       </w:r>
     </w:p>
     <w:p>
@@ -4336,7 +4336,7 @@
         <w:pStyle w:val="BodyText"/>
       </w:pPr>
       <w:r>
-        <w:t xml:space="preserve">At matched image budgets (Fig. 3b, Table 5A), neither way of spending the budget was consistently better. Seven farms × 15 images scored 0.119 against 0.087 for two farms × 50 (difference 0.032; 0.006 to 0.057; more farms better on 6/8 held-out farms), and seven farms × 50 scored 0.181 against 0.149 for four farms × all (0.031; 0.000 to 0.059; more farms better on 6/8). In the middle of the range the order reversed: four farms × 50 scored 0.108 against 0.141 for two farms × all (−0.033; −0.069 to −0.005; more farms better on 1/8). Both comparisons that favoured more farms involve the seven-farm training sets and share the confound described above. Differences are computed from unrounded values.</w:t>
+        <w:t xml:space="preserve">At matched image budgets (Fig. 3b, Table 5A), neither way of spending the budget was consistently better. Seven farms × 15 images scored 0.127 against 0.083 for two farms × 50 (difference 0.044; 0.014 to 0.075; more farms better on 6/8 held-out farms), and seven farms × 50 scored 0.182 against 0.146 for four farms × all (0.036; 0.009 to 0.061; more farms better on 6/8). In the middle of the range the order reversed: four farms × 50 scored 0.103 against 0.135 for two farms × all (−0.033; −0.066 to −0.005; more farms better on 1/8). Both comparisons that favoured more farms involve the seven-farm training sets and share the confound described above. Differences are computed from unrounded values.</w:t>
       </w:r>
     </w:p>
     <w:p>
@@ -4571,19 +4571,19 @@
               <w:jc w:val="left"/>
             </w:pPr>
             <w:r>
-              <w:t xml:space="preserve">0.119 / 0.087</w:t>
-            </w:r>
-          </w:p>
-        </w:tc>
-        <w:tc>
-          <w:tcPr/>
-          <w:p>
-            <w:pPr>
-              <w:pStyle w:val="Compact"/>
-              <w:jc w:val="left"/>
-            </w:pPr>
-            <w:r>
-              <w:t xml:space="preserve">0.032 [0.006, 0.057]</w:t>
+              <w:t xml:space="preserve">0.127 / 0.083</w:t>
+            </w:r>
+          </w:p>
+        </w:tc>
+        <w:tc>
+          <w:tcPr/>
+          <w:p>
+            <w:pPr>
+              <w:pStyle w:val="Compact"/>
+              <w:jc w:val="left"/>
+            </w:pPr>
+            <w:r>
+              <w:t xml:space="preserve">0.044 [0.014, 0.075]</w:t>
             </w:r>
           </w:p>
         </w:tc>
@@ -4645,19 +4645,19 @@
               <w:jc w:val="left"/>
             </w:pPr>
             <w:r>
-              <w:t xml:space="preserve">0.108 / 0.141</w:t>
-            </w:r>
-          </w:p>
-        </w:tc>
-        <w:tc>
-          <w:tcPr/>
-          <w:p>
-            <w:pPr>
-              <w:pStyle w:val="Compact"/>
-              <w:jc w:val="left"/>
-            </w:pPr>
-            <w:r>
-              <w:t xml:space="preserve">−0.033 [−0.069, −0.005]</w:t>
+              <w:t xml:space="preserve">0.103 / 0.135</w:t>
+            </w:r>
+          </w:p>
+        </w:tc>
+        <w:tc>
+          <w:tcPr/>
+          <w:p>
+            <w:pPr>
+              <w:pStyle w:val="Compact"/>
+              <w:jc w:val="left"/>
+            </w:pPr>
+            <w:r>
+              <w:t xml:space="preserve">−0.033 [−0.066, −0.005]</w:t>
             </w:r>
           </w:p>
         </w:tc>
@@ -4719,19 +4719,19 @@
               <w:jc w:val="left"/>
             </w:pPr>
             <w:r>
-              <w:t xml:space="preserve">0.181 / 0.149</w:t>
-            </w:r>
-          </w:p>
-        </w:tc>
-        <w:tc>
-          <w:tcPr/>
-          <w:p>
-            <w:pPr>
-              <w:pStyle w:val="Compact"/>
-              <w:jc w:val="left"/>
-            </w:pPr>
-            <w:r>
-              <w:t xml:space="preserve">0.031 [0.000, 0.059]</w:t>
+              <w:t xml:space="preserve">0.182 / 0.146</w:t>
+            </w:r>
+          </w:p>
+        </w:tc>
+        <w:tc>
+          <w:tcPr/>
+          <w:p>
+            <w:pPr>
+              <w:pStyle w:val="Compact"/>
+              <w:jc w:val="left"/>
+            </w:pPr>
+            <w:r>
+              <w:t xml:space="preserve">0.036 [0.009, 0.061]</w:t>
             </w:r>
           </w:p>
         </w:tc>
@@ -4861,43 +4861,43 @@
               <w:jc w:val="left"/>
             </w:pPr>
             <w:r>
-              <w:t xml:space="preserve">168</w:t>
-            </w:r>
-          </w:p>
-        </w:tc>
-        <w:tc>
-          <w:tcPr/>
-          <w:p>
-            <w:pPr>
-              <w:pStyle w:val="Compact"/>
-              <w:jc w:val="left"/>
-            </w:pPr>
-            <w:r>
-              <w:t xml:space="preserve">0.039 [0.025, 0.053]</w:t>
-            </w:r>
-          </w:p>
-        </w:tc>
-        <w:tc>
-          <w:tcPr/>
-          <w:p>
-            <w:pPr>
-              <w:pStyle w:val="Compact"/>
-              <w:jc w:val="left"/>
-            </w:pPr>
-            <w:r>
-              <w:t xml:space="preserve">0.030 [0.023, 0.039]</w:t>
-            </w:r>
-          </w:p>
-        </w:tc>
-        <w:tc>
-          <w:tcPr/>
-          <w:p>
-            <w:pPr>
-              <w:pStyle w:val="Compact"/>
-              <w:jc w:val="left"/>
-            </w:pPr>
-            <w:r>
-              <w:t xml:space="preserve">0.009 [−0.003, 0.023]</w:t>
+              <w:t xml:space="preserve">336</w:t>
+            </w:r>
+          </w:p>
+        </w:tc>
+        <w:tc>
+          <w:tcPr/>
+          <w:p>
+            <w:pPr>
+              <w:pStyle w:val="Compact"/>
+              <w:jc w:val="left"/>
+            </w:pPr>
+            <w:r>
+              <w:t xml:space="preserve">0.038 [0.023, 0.053]</w:t>
+            </w:r>
+          </w:p>
+        </w:tc>
+        <w:tc>
+          <w:tcPr/>
+          <w:p>
+            <w:pPr>
+              <w:pStyle w:val="Compact"/>
+              <w:jc w:val="left"/>
+            </w:pPr>
+            <w:r>
+              <w:t xml:space="preserve">0.028 [0.021, 0.038]</w:t>
+            </w:r>
+          </w:p>
+        </w:tc>
+        <w:tc>
+          <w:tcPr/>
+          <w:p>
+            <w:pPr>
+              <w:pStyle w:val="Compact"/>
+              <w:jc w:val="left"/>
+            </w:pPr>
+            <w:r>
+              <w:t xml:space="preserve">0.010 [−0.003, 0.025]</w:t>
             </w:r>
           </w:p>
         </w:tc>
@@ -4923,43 +4923,43 @@
               <w:jc w:val="left"/>
             </w:pPr>
             <w:r>
-              <w:t xml:space="preserve">126</w:t>
-            </w:r>
-          </w:p>
-        </w:tc>
-        <w:tc>
-          <w:tcPr/>
-          <w:p>
-            <w:pPr>
-              <w:pStyle w:val="Compact"/>
-              <w:jc w:val="left"/>
-            </w:pPr>
-            <w:r>
-              <w:t xml:space="preserve">0.036 [0.022, 0.051]</w:t>
-            </w:r>
-          </w:p>
-        </w:tc>
-        <w:tc>
-          <w:tcPr/>
-          <w:p>
-            <w:pPr>
-              <w:pStyle w:val="Compact"/>
-              <w:jc w:val="left"/>
-            </w:pPr>
-            <w:r>
-              <w:t xml:space="preserve">0.032 [0.024, 0.043]</w:t>
-            </w:r>
-          </w:p>
-        </w:tc>
-        <w:tc>
-          <w:tcPr/>
-          <w:p>
-            <w:pPr>
-              <w:pStyle w:val="Compact"/>
-              <w:jc w:val="left"/>
-            </w:pPr>
-            <w:r>
-              <w:t xml:space="preserve">0.003 [−0.009, 0.018]</w:t>
+              <w:t xml:space="preserve">252</w:t>
+            </w:r>
+          </w:p>
+        </w:tc>
+        <w:tc>
+          <w:tcPr/>
+          <w:p>
+            <w:pPr>
+              <w:pStyle w:val="Compact"/>
+              <w:jc w:val="left"/>
+            </w:pPr>
+            <w:r>
+              <w:t xml:space="preserve">0.035 [0.020, 0.052]</w:t>
+            </w:r>
+          </w:p>
+        </w:tc>
+        <w:tc>
+          <w:tcPr/>
+          <w:p>
+            <w:pPr>
+              <w:pStyle w:val="Compact"/>
+              <w:jc w:val="left"/>
+            </w:pPr>
+            <w:r>
+              <w:t xml:space="preserve">0.030 [0.022, 0.041]</w:t>
+            </w:r>
+          </w:p>
+        </w:tc>
+        <w:tc>
+          <w:tcPr/>
+          <w:p>
+            <w:pPr>
+              <w:pStyle w:val="Compact"/>
+              <w:jc w:val="left"/>
+            </w:pPr>
+            <w:r>
+              <w:t xml:space="preserve">0.005 [−0.009, 0.021]</w:t>
             </w:r>
           </w:p>
         </w:tc>
@@ -4985,43 +4985,43 @@
               <w:jc w:val="left"/>
             </w:pPr>
             <w:r>
-              <w:t xml:space="preserve">144</w:t>
-            </w:r>
-          </w:p>
-        </w:tc>
-        <w:tc>
-          <w:tcPr/>
-          <w:p>
-            <w:pPr>
-              <w:pStyle w:val="Compact"/>
-              <w:jc w:val="left"/>
-            </w:pPr>
-            <w:r>
-              <w:t xml:space="preserve">0.030 [0.016, 0.044]</w:t>
-            </w:r>
-          </w:p>
-        </w:tc>
-        <w:tc>
-          <w:tcPr/>
-          <w:p>
-            <w:pPr>
-              <w:pStyle w:val="Compact"/>
-              <w:jc w:val="left"/>
-            </w:pPr>
-            <w:r>
-              <w:t xml:space="preserve">0.028 [0.021, 0.037]</w:t>
-            </w:r>
-          </w:p>
-        </w:tc>
-        <w:tc>
-          <w:tcPr/>
-          <w:p>
-            <w:pPr>
-              <w:pStyle w:val="Compact"/>
-              <w:jc w:val="left"/>
-            </w:pPr>
-            <w:r>
-              <w:t xml:space="preserve">0.002 [−0.011, 0.016]</w:t>
+              <w:t xml:space="preserve">288</w:t>
+            </w:r>
+          </w:p>
+        </w:tc>
+        <w:tc>
+          <w:tcPr/>
+          <w:p>
+            <w:pPr>
+              <w:pStyle w:val="Compact"/>
+              <w:jc w:val="left"/>
+            </w:pPr>
+            <w:r>
+              <w:t xml:space="preserve">0.028 [0.014, 0.042]</w:t>
+            </w:r>
+          </w:p>
+        </w:tc>
+        <w:tc>
+          <w:tcPr/>
+          <w:p>
+            <w:pPr>
+              <w:pStyle w:val="Compact"/>
+              <w:jc w:val="left"/>
+            </w:pPr>
+            <w:r>
+              <w:t xml:space="preserve">0.027 [0.019, 0.036]</w:t>
+            </w:r>
+          </w:p>
+        </w:tc>
+        <w:tc>
+          <w:tcPr/>
+          <w:p>
+            <w:pPr>
+              <w:pStyle w:val="Compact"/>
+              <w:jc w:val="left"/>
+            </w:pPr>
+            <w:r>
+              <w:t xml:space="preserve">0.001 [−0.012, 0.015]</w:t>
             </w:r>
           </w:p>
         </w:tc>
@@ -5047,43 +5047,43 @@
               <w:jc w:val="left"/>
             </w:pPr>
             <w:r>
-              <w:t xml:space="preserve">120</w:t>
-            </w:r>
-          </w:p>
-        </w:tc>
-        <w:tc>
-          <w:tcPr/>
-          <w:p>
-            <w:pPr>
-              <w:pStyle w:val="Compact"/>
-              <w:jc w:val="left"/>
-            </w:pPr>
-            <w:r>
-              <w:t xml:space="preserve">0.041 [0.030, 0.053]</w:t>
-            </w:r>
-          </w:p>
-        </w:tc>
-        <w:tc>
-          <w:tcPr/>
-          <w:p>
-            <w:pPr>
-              <w:pStyle w:val="Compact"/>
-              <w:jc w:val="left"/>
-            </w:pPr>
-            <w:r>
-              <w:t xml:space="preserve">0.033 [0.024, 0.044]</w:t>
-            </w:r>
-          </w:p>
-        </w:tc>
-        <w:tc>
-          <w:tcPr/>
-          <w:p>
-            <w:pPr>
-              <w:pStyle w:val="Compact"/>
-              <w:jc w:val="left"/>
-            </w:pPr>
-            <w:r>
-              <w:t xml:space="preserve">0.008 [−0.003, 0.020]</w:t>
+              <w:t xml:space="preserve">240</w:t>
+            </w:r>
+          </w:p>
+        </w:tc>
+        <w:tc>
+          <w:tcPr/>
+          <w:p>
+            <w:pPr>
+              <w:pStyle w:val="Compact"/>
+              <w:jc w:val="left"/>
+            </w:pPr>
+            <w:r>
+              <w:t xml:space="preserve">0.043 [0.030, 0.056]</w:t>
+            </w:r>
+          </w:p>
+        </w:tc>
+        <w:tc>
+          <w:tcPr/>
+          <w:p>
+            <w:pPr>
+              <w:pStyle w:val="Compact"/>
+              <w:jc w:val="left"/>
+            </w:pPr>
+            <w:r>
+              <w:t xml:space="preserve">0.030 [0.022, 0.040]</w:t>
+            </w:r>
+          </w:p>
+        </w:tc>
+        <w:tc>
+          <w:tcPr/>
+          <w:p>
+            <w:pPr>
+              <w:pStyle w:val="Compact"/>
+              <w:jc w:val="left"/>
+            </w:pPr>
+            <w:r>
+              <w:t xml:space="preserve">0.013 [0.002, 0.024]</w:t>
             </w:r>
           </w:p>
         </w:tc>
@@ -5109,43 +5109,43 @@
               <w:jc w:val="left"/>
             </w:pPr>
             <w:r>
-              <w:t xml:space="preserve">168</w:t>
-            </w:r>
-          </w:p>
-        </w:tc>
-        <w:tc>
-          <w:tcPr/>
-          <w:p>
-            <w:pPr>
-              <w:pStyle w:val="Compact"/>
-              <w:jc w:val="left"/>
-            </w:pPr>
-            <w:r>
-              <w:t xml:space="preserve">0.039 [0.022, 0.055]</w:t>
-            </w:r>
-          </w:p>
-        </w:tc>
-        <w:tc>
-          <w:tcPr/>
-          <w:p>
-            <w:pPr>
-              <w:pStyle w:val="Compact"/>
-              <w:jc w:val="left"/>
-            </w:pPr>
-            <w:r>
-              <w:t xml:space="preserve">0.030 [0.022, 0.039]</w:t>
-            </w:r>
-          </w:p>
-        </w:tc>
-        <w:tc>
-          <w:tcPr/>
-          <w:p>
-            <w:pPr>
-              <w:pStyle w:val="Compact"/>
-              <w:jc w:val="left"/>
-            </w:pPr>
-            <w:r>
-              <w:t xml:space="preserve">0.009 [−0.005, 0.025]</w:t>
+              <w:t xml:space="preserve">336</w:t>
+            </w:r>
+          </w:p>
+        </w:tc>
+        <w:tc>
+          <w:tcPr/>
+          <w:p>
+            <w:pPr>
+              <w:pStyle w:val="Compact"/>
+              <w:jc w:val="left"/>
+            </w:pPr>
+            <w:r>
+              <w:t xml:space="preserve">0.039 [0.021, 0.057]</w:t>
+            </w:r>
+          </w:p>
+        </w:tc>
+        <w:tc>
+          <w:tcPr/>
+          <w:p>
+            <w:pPr>
+              <w:pStyle w:val="Compact"/>
+              <w:jc w:val="left"/>
+            </w:pPr>
+            <w:r>
+              <w:t xml:space="preserve">0.028 [0.021, 0.038]</w:t>
+            </w:r>
+          </w:p>
+        </w:tc>
+        <w:tc>
+          <w:tcPr/>
+          <w:p>
+            <w:pPr>
+              <w:pStyle w:val="Compact"/>
+              <w:jc w:val="left"/>
+            </w:pPr>
+            <w:r>
+              <w:t xml:space="preserve">0.011 [−0.005, 0.028]</w:t>
             </w:r>
           </w:p>
         </w:tc>
@@ -5156,7 +5156,7 @@
         <w:pStyle w:val="BodyText"/>
       </w:pPr>
       <w:r>
-        <w:t xml:space="preserve">Part of the value of a farm is the classes it carries. Training sets drawn from one farm covered, on average, 63% of the held-out farm’s annotated images, and those from two farms 84%; almost every set drawn from four or more farms covered all of them. Within the one-farm and two-farm sets, where coverage varies, it was correlated with unseen-farm mAP50 (Spearman ρ = 0.59 and 0.61). Coverage does not account for the farm slope, however: with coverage added to the regression the slope for doubling farms was 0.039 (0.022 to 0.055), and restricted to the 126 runs whose training images covered every class present on the held-out farm it was 0.036 against 0.032 for doubling images per farm (Table 5B).</w:t>
+        <w:t xml:space="preserve">Part of the value of a farm is the classes it carries. Training sets drawn from one farm covered, on average, 63% of the held-out farm’s annotated images, and those from two farms 84%; almost every set drawn from four or more farms covered all of them. Within the one-farm and two-farm sets, where coverage varies, it was correlated with unseen-farm mAP50 (Spearman ρ = 0.62 and 0.64). Coverage does not account for the farm slope, however: with coverage added to the regression the slope for doubling farms was 0.039 (0.021 to 0.057), and restricted to the 252 runs whose training images covered every class present on the held-out farm it was 0.035 against 0.030 for doubling images per farm (Table 5B).</w:t>
       </w:r>
     </w:p>
     <w:bookmarkEnd w:id="43"/>
@@ -5174,7 +5174,7 @@
         <w:pStyle w:val="FirstParagraph"/>
       </w:pPr>
       <w:r>
-        <w:t xml:space="preserve">With all images per farm, AP50 on the unseen farm was higher with seven training farms than with one for every class, although not every intermediate step was an improvement, and the psyllid classes remained lowest throughout (Fig. 4; Table S3): with seven farms, psyllid reached 0.103 and psyllid damage 0.055, against 0.222–0.408 for the other four classes.</w:t>
+        <w:t xml:space="preserve">With all images per farm, AP50 on the unseen farm was higher with seven training farms than with one for every class, although not every intermediate step was an improvement, and the psyllid classes remained lowest throughout (Fig. 4; Table S3): with seven farms, psyllid reached 0.108 and psyllid damage 0.058, against 0.217–0.388 for the other four classes.</w:t>
       </w:r>
     </w:p>
     <w:p>
@@ -5257,7 +5257,7 @@
         <w:pStyle w:val="FirstParagraph"/>
       </w:pPr>
       <w:r>
-        <w:t xml:space="preserve">Without calibration, the detector trained on the other seven farms scored 0.247 on the test halves (Table 6, Fig. 5). Fine-tuning it on images from the calibration half lowered mAP50 at every size: by 0.121, 0.080 and 0.057 with 5, 10 and 20 images and by 0.044 with the whole half (about 50 images; better than no calibration on 1/8 farms). The fine-tuned detector became more conservative: with 5 images its precision rose by 0.068 while its recall fell by 0.143, and most of the loss fell on leafhopper damage and leaf rot (−0.379 and −0.205 AP50). Retraining with the same images added to the other seven farms did not lose accuracy on average: it changed mAP50 by +0.004, +0.004, +0.030 (−0.001 to 0.062) and +0.053 (0.014 to 0.100; better on 6/8 farms), raising both precision and recall with the whole half. With 5 or 10 images the change was well within the seed-to-seed variation of a single farm’s score; only with the whole half did the interval exclude zero.</w:t>
+        <w:t xml:space="preserve">Without calibration, the detector trained on the other seven farms scored 0.240 on the test halves (Table 6, Fig. 5). Fine-tuning it on images from the calibration half lowered mAP50 at every size: by 0.111, 0.080 and 0.055 with 5, 10 and 20 images and by 0.029 with the whole half (about 50 images; −0.056 to 0.003, better than no calibration on 2/8 farms), the one size at which the loss was within the uncertainty. The fine-tuned detector became more conservative: with 5 images its precision rose by 0.086 while its recall fell by 0.141, and most of the loss fell on leafhopper damage and leaf rot (−0.350 and −0.179 AP50). Retraining with the same images added to the other seven farms did not lose accuracy on average: it changed mAP50 by +0.004, +0.004, +0.030 (−0.001 to 0.062) and +0.053 (0.014 to 0.100; better on 6/8 farms), raising both precision and recall with the whole half. With 5 or 10 images the change was well within the seed-to-seed variation of a single farm’s score; only with the whole half did the interval exclude zero.</w:t>
       </w:r>
     </w:p>
     <w:p>
@@ -5455,7 +5455,7 @@
               <w:jc w:val="left"/>
             </w:pPr>
             <w:r>
-              <w:t xml:space="preserve">0.247</w:t>
+              <w:t xml:space="preserve">0.240</w:t>
             </w:r>
           </w:p>
         </w:tc>
@@ -5517,19 +5517,19 @@
               <w:jc w:val="left"/>
             </w:pPr>
             <w:r>
-              <w:t xml:space="preserve">0.127</w:t>
-            </w:r>
-          </w:p>
-        </w:tc>
-        <w:tc>
-          <w:tcPr/>
-          <w:p>
-            <w:pPr>
-              <w:pStyle w:val="Compact"/>
-              <w:jc w:val="left"/>
-            </w:pPr>
-            <w:r>
-              <w:t xml:space="preserve">−0.121 [−0.165, −0.074]</w:t>
+              <w:t xml:space="preserve">0.129</w:t>
+            </w:r>
+          </w:p>
+        </w:tc>
+        <w:tc>
+          <w:tcPr/>
+          <w:p>
+            <w:pPr>
+              <w:pStyle w:val="Compact"/>
+              <w:jc w:val="left"/>
+            </w:pPr>
+            <w:r>
+              <w:t xml:space="preserve">−0.111 [−0.157, −0.062]</w:t>
             </w:r>
           </w:p>
         </w:tc>
@@ -5579,19 +5579,19 @@
               <w:jc w:val="left"/>
             </w:pPr>
             <w:r>
-              <w:t xml:space="preserve">0.167</w:t>
-            </w:r>
-          </w:p>
-        </w:tc>
-        <w:tc>
-          <w:tcPr/>
-          <w:p>
-            <w:pPr>
-              <w:pStyle w:val="Compact"/>
-              <w:jc w:val="left"/>
-            </w:pPr>
-            <w:r>
-              <w:t xml:space="preserve">−0.080 [−0.123, −0.039]</w:t>
+              <w:t xml:space="preserve">0.160</w:t>
+            </w:r>
+          </w:p>
+        </w:tc>
+        <w:tc>
+          <w:tcPr/>
+          <w:p>
+            <w:pPr>
+              <w:pStyle w:val="Compact"/>
+              <w:jc w:val="left"/>
+            </w:pPr>
+            <w:r>
+              <w:t xml:space="preserve">−0.080 [−0.121, −0.036]</w:t>
             </w:r>
           </w:p>
         </w:tc>
@@ -5641,19 +5641,19 @@
               <w:jc w:val="left"/>
             </w:pPr>
             <w:r>
-              <w:t xml:space="preserve">0.190</w:t>
-            </w:r>
-          </w:p>
-        </w:tc>
-        <w:tc>
-          <w:tcPr/>
-          <w:p>
-            <w:pPr>
-              <w:pStyle w:val="Compact"/>
-              <w:jc w:val="left"/>
-            </w:pPr>
-            <w:r>
-              <w:t xml:space="preserve">−0.057 [−0.086, −0.025]</w:t>
+              <w:t xml:space="preserve">0.185</w:t>
+            </w:r>
+          </w:p>
+        </w:tc>
+        <w:tc>
+          <w:tcPr/>
+          <w:p>
+            <w:pPr>
+              <w:pStyle w:val="Compact"/>
+              <w:jc w:val="left"/>
+            </w:pPr>
+            <w:r>
+              <w:t xml:space="preserve">−0.055 [−0.088, −0.017]</w:t>
             </w:r>
           </w:p>
         </w:tc>
@@ -5703,31 +5703,31 @@
               <w:jc w:val="left"/>
             </w:pPr>
             <w:r>
-              <w:t xml:space="preserve">0.203</w:t>
-            </w:r>
-          </w:p>
-        </w:tc>
-        <w:tc>
-          <w:tcPr/>
-          <w:p>
-            <w:pPr>
-              <w:pStyle w:val="Compact"/>
-              <w:jc w:val="left"/>
-            </w:pPr>
-            <w:r>
-              <w:t xml:space="preserve">−0.044 [−0.075, −0.012]</w:t>
-            </w:r>
-          </w:p>
-        </w:tc>
-        <w:tc>
-          <w:tcPr/>
-          <w:p>
-            <w:pPr>
-              <w:pStyle w:val="Compact"/>
-              <w:jc w:val="left"/>
-            </w:pPr>
-            <w:r>
-              <w:t xml:space="preserve">1 of 8</w:t>
+              <w:t xml:space="preserve">0.211</w:t>
+            </w:r>
+          </w:p>
+        </w:tc>
+        <w:tc>
+          <w:tcPr/>
+          <w:p>
+            <w:pPr>
+              <w:pStyle w:val="Compact"/>
+              <w:jc w:val="left"/>
+            </w:pPr>
+            <w:r>
+              <w:t xml:space="preserve">−0.029 [−0.056, 0.003]</w:t>
+            </w:r>
+          </w:p>
+        </w:tc>
+        <w:tc>
+          <w:tcPr/>
+          <w:p>
+            <w:pPr>
+              <w:pStyle w:val="Compact"/>
+              <w:jc w:val="left"/>
+            </w:pPr>
+            <w:r>
+              <w:t xml:space="preserve">2 of 8</w:t>
             </w:r>
           </w:p>
         </w:tc>
@@ -6050,7 +6050,7 @@
         <w:pStyle w:val="FirstParagraph"/>
       </w:pPr>
       <w:r>
-        <w:t xml:space="preserve">With training length held constant, both levers helped by similar amounts: a doubling of farms and a doubling of images per farm raised unseen-farm mAP50 by 0.039 and 0.030, and the data cannot separate the two. Two features of the design qualify any stronger reading. The steps in farms were uneven, with little change from two to four farms when all images per farm were used and a large gain at seven that the design cannot attribute to the number of farms alone; and at matched budgets more farms won twice and lost once. How training length is set also matters. In an earlier version of the experiment that capped training at 300 epochs, and so gave the smallest budgets far fewer iterations, the farm slope was 0.039, as here, but the slope for images per farm was 0.026 rather than 0.030, and the difference between them, 0.013 (0.001 to 0.027), would have favoured farms (Table S7). That schedule also scored higher in 11 of the 12 budget cells, including cells in which both schedules gave about the same number of iterations, so the two differ in more than training length; the differences are listed with Table S7. Neither schedule is neutral, and the balance between the two levers depends in part on the choice. What distinguishes a farm is the classes it carries: a training set that lacks a class present on the target farm cannot detect it, and</w:t>
+        <w:t xml:space="preserve">With training length held constant, both levers helped by similar amounts: a doubling of farms and a doubling of images per farm raised unseen-farm mAP50 by 0.038 and 0.028, and the data cannot separate the two. Two features of the design qualify any stronger reading. The steps in farms were uneven, with little change from two to four farms when all images per farm were used and a large gain at seven that the design cannot attribute to the number of farms alone; the advantage of farms in the regression depended on those seven-farm sets; and at matched budgets more farms won twice, both times with seven farms, and lost once. How training length is set also matters. In an earlier version of the experiment that capped training at 300 epochs, and so gave the smallest budgets far fewer iterations, the farm slope for the same seed was 0.039, as with fixed iterations (0.039), but the slope for images per farm was 0.026 rather than 0.030, so that the difference between them, 0.013 (0.001 to 0.027), would have favoured farms (Table S7). That schedule also scored higher in 11 of the 12 budget cells for the same seed, including cells in which both schedules gave about the same number of iterations, so the two differ in more than training length; the differences are listed with Table S7. Neither schedule is neutral, and the balance between the two levers depends in part on the choice. What distinguishes a farm is the classes it carries: a training set that lacks a class present on the target farm cannot detect it, and</w:t>
       </w:r>
       <w:r>
         <w:t xml:space="preserve"> </w:t>
@@ -6118,7 +6118,7 @@
         <w:pStyle w:val="FirstParagraph"/>
       </w:pPr>
       <w:r>
-        <w:t xml:space="preserve">A device that meets a new farm could be adapted with a few images taken on arrival. Done by fine-tuning on those images alone, with the recipe tested, calibration made the detector worse: with 5 images mAP50 fell by 0.121, and even with about 50 images it remained 0.044 below the uncalibrated starting point of 0.247. The pattern of the loss, higher precision and lower recall concentrated in some classes, is what one would expect if a detector adjusted to a handful of images, which carry only some of the classes and few examples of each, learns to suppress what those images lack. Ruigrok et al. (2023) found the opposite for weed detection, where fine-tuning on as few as 25 images already reduced the generalisation error, with a different task and training setup. The fine-tuning recipe here was fixed in advance and not tuned; a lower learning rate, fewer steps or mixing the original training images into fine-tuning might avoid the loss, and this was not tested. Adding the same images to the training set and retraining avoided the loss, although with 5–10 images it made no measurable difference; only with about 50 images did it raise mAP50 clearly, by 0.053. Retraining is not a like-for-like alternative: it costs a full training run and would be done off the device, after the images are returned. The practical conclusion is to treat a new farm’s labelled images as additional training data rather than as a fine-tuning set on their own, and to collect a few tens of them rather than a handful. The calibration images were labelled by the author, so these results bound what calibration can achieve when a grower’s images are labelled correctly; in practice that labelling is the cost.</w:t>
+        <w:t xml:space="preserve">A device that meets a new farm could be adapted with a few images taken on arrival. Done by fine-tuning on those images alone, with the recipe tested, calibration made the detector worse: with 5 images mAP50 fell by 0.111, and even with about 50 images it remained 0.029 below the uncalibrated starting point of 0.240, although by then the difference was within the uncertainty. The pattern of the loss, higher precision and lower recall concentrated in some classes, is what one would expect if a detector adjusted to a handful of images, which carry only some of the classes and few examples of each, learns to suppress what those images lack. Ruigrok et al. (2023) found the opposite for weed detection, where fine-tuning on as few as 25 images already reduced the generalisation error, with a different task and training setup. The fine-tuning recipe here was fixed in advance and not tuned; a lower learning rate, fewer steps or mixing the original training images into fine-tuning might avoid the loss, and this was not tested. Adding the same images to the training set and retraining avoided the loss, although with 5–10 images it made no measurable difference; only with about 50 images did it raise mAP50 clearly, by 0.053. Retraining is not a like-for-like alternative: it costs a full training run and would be done off the device, after the images are returned. The practical conclusion is to treat a new farm’s labelled images as additional training data rather than as a fine-tuning set on their own, and to collect a few tens of them rather than a handful. The calibration images were labelled by the author, so these results bound what calibration can achieve when a grower’s images are labelled correctly; in practice that labelling is the cost.</w:t>
       </w:r>
     </w:p>
     <w:bookmarkEnd w:id="57"/>
@@ -6149,7 +6149,7 @@
         <w:t xml:space="preserve">Phomopsis</w:t>
       </w:r>
       <w:r>
-        <w:t xml:space="preserve">, so its per-class figure rests on three. Inter-annotator agreement was not measured, and any bias in the annotation standard could interact with farm composition. Per-class figures on individual farms are noisy where a class has few examples; the ordering was stable when such farms were excluded, but the magnitudes moved. The experiments on training data used one detector, two farm draws per budget (which differed by a median of 0.036 mAP50 on the same held-out farm; Table S5) and one seed per configuration; the seed-to-seed standard deviation of a leave-one-farm-out YOLO11n score on a single farm averaged 0.026 mAP50, comparable to several of the paired differences, so per-farm win counts should be read with that in mind. The seven-farm training sets are a single combination per held-out farm, and the fixed number of iterations is a choice rather than a neutral default. The random split is a single partition, so its figure carries no split-to-split variation. The calibration experiment tested one fine-tuning recipe, fixed in advance. The bootstrap intervals resample eight farms that share training data and are approximate. All results are offline evaluations of images; the device’s latency and energy, and how growers act on its suggestions, were not measured here.</w:t>
+        <w:t xml:space="preserve">, so its per-class figure rests on three. Inter-annotator agreement was not measured, and any bias in the annotation standard could interact with farm composition. Per-class figures on individual farms are noisy where a class has few examples; the ordering was stable when such farms were excluded, but the magnitudes moved. The experiments on training data used one detector, two farm draws per budget (which differed by a median of 0.051 mAP50 on the same held-out farm; Table S5) and two seeds per configuration; the seed-to-seed standard deviation of a leave-one-farm-out YOLO11n score on a single farm averaged 0.026 mAP50, comparable to several of the paired differences, so per-farm win counts should be read with that in mind. The seven-farm training sets are a single combination per held-out farm, and the fixed number of iterations is a choice rather than a neutral default. The random split is a single partition, so its figure carries no split-to-split variation. The calibration experiment tested one fine-tuning recipe, fixed in advance. The bootstrap intervals resample eight farms that share training data and are approximate. All results are offline evaluations of images; the device’s latency and energy, and how growers act on its suggestions, were not measured here.</w:t>
       </w:r>
     </w:p>
     <w:bookmarkEnd w:id="58"/>

</xml_diff>

<commit_message>
Fill dataset DOI (zenodo.22030623); cite code by GitHub URL
Co-Authored-By: Claude Opus 5.5 <noreply@anthropic.com>
Claude-Session: https://claude.ai/code/session_01MKk9JY43DLLC2GkbFX456R
</commit_message>
<xml_diff>
--- a/paper/manuscript.docx
+++ b/paper/manuscript.docx
@@ -6286,7 +6286,7 @@
         <w:pStyle w:val="FirstParagraph"/>
       </w:pPr>
       <w:r>
-        <w:t xml:space="preserve">The durian images and annotations are deposited on Zenodo (TODO: new Zenodo version DOI of the durian dataset (with content-based farm attribution); CC BY-NC 4.0) at 640 × 640 pixels with location coordinates removed, together with the content-based farm attribution and all split manifests; the 827-image analysis pool and the 281-image Sabah set are identified in the manifests.</w:t>
+        <w:t xml:space="preserve">The durian images and annotations are deposited on Zenodo (https://doi.org/10.5281/zenodo.22030623; CC BY-NC 4.0) at 640 × 640 pixels with location coordinates removed, together with the content-based farm attribution and all split manifests; the 827-image analysis pool and the 281-image Sabah set are identified in the manifests.</w:t>
       </w:r>
     </w:p>
     <w:bookmarkEnd w:id="66"/>
@@ -6304,7 +6304,7 @@
         <w:pStyle w:val="FirstParagraph"/>
       </w:pPr>
       <w:r>
-        <w:t xml:space="preserve">Training, evaluation and analysis code, the result tables behind every figure and table, and a script that recomputes every number in this paper from those tables are available at https://github.com/xiaolin200206/durian-site-split (TODO: Zenodo DOI of the GitHub release).</w:t>
+        <w:t xml:space="preserve">Training, evaluation and analysis code, the result tables behind every figure and table, and a script that recomputes every number in this paper from those tables are available at https://github.com/xiaolin200206/durian-site-split.</w:t>
       </w:r>
     </w:p>
     <w:bookmarkEnd w:id="67"/>

</xml_diff>